<commit_message>
v0.2: comparativa sudamericana a la Telles (12 países), horse race, auto-aclaramiento, coefplot
Co-Authored-By: Claude Fable 5 <noreply@anthropic.com>
Claude-Session: https://claude.ai/code/session_01CsCbMY1hnLuvzYwE8RCuCQ
</commit_message>
<xml_diff>
--- a/docs/especificaciones_modelos.docx
+++ b/docs/especificaciones_modelos.docx
@@ -30,7 +30,7 @@
           <w:sz w:val="24"/>
           <w:szCs w:val="24"/>
         </w:rPr>
-        <w:t xml:space="preserve">Documento vivo de especificaciones — v0.1 (18-jul-2026)</w:t>
+        <w:t xml:space="preserve">Documento vivo de especificaciones — v0.2 (18-jul-2026)</w:t>
       </w:r>
     </w:p>
     <w:p>
@@ -44,7 +44,7 @@
           <w:sz w:val="20"/>
           <w:szCs w:val="20"/>
         </w:rPr>
-        <w:t xml:space="preserve">Proyecto SkinColor_LATAM · Datos: LAPOP AmericasBarometer, Argentina 2004–2023 (v1.0_w) · Código: R/01_prepare_data.R y R/02_models_argentina.R</w:t>
+        <w:t xml:space="preserve">Proyecto SkinColor_LATAM · Datos: LAPOP AmericasBarometer 2004–2023 (Argentina + Sudamérica) · Código: R/01_prepare_data.R, R/02_models_argentina.R, R/03_models_southamerica.R</w:t>
       </w:r>
     </w:p>
     <w:p>
@@ -2343,7 +2343,1653 @@
         <w:rPr>
           <w:rFonts w:ascii="Calibri" w:cs="Calibri" w:eastAsia="Calibri" w:hAnsi="Calibri"/>
         </w:rPr>
-        <w:t xml:space="preserve">7. Agenda</w:t>
+        <w:t xml:space="preserve">7. Comparativa sudamericana à la Telles (v0.2)</w:t>
+      </w:r>
+    </w:p>
+    <w:p>
+      <w:pPr>
+        <w:spacing w:after="120"/>
+      </w:pPr>
+      <w:r>
+        <w:rPr>
+          <w:rFonts w:ascii="Calibri" w:cs="Calibri" w:eastAsia="Calibri" w:hAnsi="Calibri"/>
+          <w:sz w:val="22"/>
+          <w:szCs w:val="22"/>
+        </w:rPr>
+        <w:t xml:space="preserve">Datos: subset del Grand Merge (data/sudamerica_subset.dta): 12 países, olas 2010–2019 con colori y ed, ~76.000 observaciones 25+. Especificación: espejo exacto de M1 por país, con colori en escala cruda 1–11 (efecto por punto) — estandarizar dentro de cada país mezclaría diferencias de efecto con diferencias de varianza del color. Para comparabilidad se reporta el efecto por SD pooled (1.69 puntos). Pooled con weight1500 (estandariza cada país-ola) e interacciones país × color con base Argentina. Código: R/03_models_southamerica.R.</w:t>
+      </w:r>
+    </w:p>
+    <w:p>
+      <w:pPr>
+        <w:pStyle w:val="Heading2"/>
+        <w:spacing w:after="110" w:before="220"/>
+      </w:pPr>
+      <w:r>
+        <w:rPr>
+          <w:rFonts w:ascii="Calibri" w:cs="Calibri" w:eastAsia="Calibri" w:hAnsi="Calibri"/>
+        </w:rPr>
+        <w:t xml:space="preserve">7.1 Penalidad de color por país (años de educación por +1 SD pooled)</w:t>
+      </w:r>
+    </w:p>
+    <w:p>
+      <w:pPr>
+        <w:spacing w:after="140"/>
+      </w:pPr>
+      <w:r>
+        <w:drawing>
+          <wp:inline distT="0" distB="0" distL="0" distR="0">
+            <wp:extent cx="5905500" cy="3810000"/>
+            <wp:effectExtent t="0" r="0" b="0" l="0"/>
+            <wp:docPr id="1" name="" descr="" title=""/>
+            <wp:cNvGraphicFramePr>
+              <a:graphicFrameLocks xmlns:a="http://schemas.openxmlformats.org/drawingml/2006/main" noChangeAspect="1"/>
+            </wp:cNvGraphicFramePr>
+            <a:graphic xmlns:a="http://schemas.openxmlformats.org/drawingml/2006/main">
+              <a:graphicData uri="http://schemas.openxmlformats.org/drawingml/2006/picture">
+                <pic:pic xmlns:pic="http://schemas.openxmlformats.org/drawingml/2006/picture">
+                  <pic:nvPicPr>
+                    <pic:cNvPr id="0" name="" descr=""/>
+                    <pic:cNvPicPr>
+                      <a:picLocks noChangeAspect="1" noChangeArrowheads="1"/>
+                    </pic:cNvPicPr>
+                  </pic:nvPicPr>
+                  <pic:blipFill>
+                    <a:blip r:embed="rId7" cstate="none"/>
+                    <a:srcRect/>
+                    <a:stretch>
+                      <a:fillRect/>
+                    </a:stretch>
+                  </pic:blipFill>
+                  <pic:spPr bwMode="auto">
+                    <a:xfrm>
+                      <a:off x="0" y="0"/>
+                      <a:ext cx="5905500" cy="3810000"/>
+                    </a:xfrm>
+                    <a:prstGeom prst="rect">
+                      <a:avLst/>
+                    </a:prstGeom>
+                  </pic:spPr>
+                </pic:pic>
+              </a:graphicData>
+            </a:graphic>
+          </wp:inline>
+        </w:drawing>
+      </w:r>
+    </w:p>
+    <w:tbl>
+      <w:tblPr>
+        <w:tblW w:type="dxa" w:w="9360"/>
+        <w:tblBorders>
+          <w:top w:val="single" w:color="auto" w:sz="4"/>
+          <w:left w:val="single" w:color="auto" w:sz="4"/>
+          <w:bottom w:val="single" w:color="auto" w:sz="4"/>
+          <w:right w:val="single" w:color="auto" w:sz="4"/>
+          <w:insideH w:val="single" w:color="auto" w:sz="4"/>
+          <w:insideV w:val="single" w:color="auto" w:sz="4"/>
+        </w:tblBorders>
+      </w:tblPr>
+      <w:tblGrid>
+        <w:gridCol w:w="2100"/>
+        <w:gridCol w:w="1300"/>
+        <w:gridCol w:w="1400"/>
+        <w:gridCol w:w="2560"/>
+        <w:gridCol w:w="2000"/>
+      </w:tblGrid>
+      <w:tr>
+        <w:tc>
+          <w:tcPr>
+            <w:tcW w:type="dxa" w:w="2100"/>
+            <w:shd w:fill="E8EEF7" w:val="clear"/>
+            <w:tcMar>
+              <w:top w:type="dxa" w:w="60"/>
+              <w:left w:type="dxa" w:w="100"/>
+              <w:bottom w:type="dxa" w:w="60"/>
+              <w:right w:type="dxa" w:w="100"/>
+            </w:tcMar>
+          </w:tcPr>
+          <w:p>
+            <w:r>
+              <w:rPr>
+                <w:rFonts w:ascii="Calibri" w:cs="Calibri" w:eastAsia="Calibri" w:hAnsi="Calibri"/>
+                <w:b/>
+                <w:bCs/>
+                <w:sz w:val="19"/>
+                <w:szCs w:val="19"/>
+              </w:rPr>
+              <w:t xml:space="preserve">País</w:t>
+            </w:r>
+          </w:p>
+        </w:tc>
+        <w:tc>
+          <w:tcPr>
+            <w:tcW w:type="dxa" w:w="1300"/>
+            <w:shd w:fill="E8EEF7" w:val="clear"/>
+            <w:tcMar>
+              <w:top w:type="dxa" w:w="60"/>
+              <w:left w:type="dxa" w:w="100"/>
+              <w:bottom w:type="dxa" w:w="60"/>
+              <w:right w:type="dxa" w:w="100"/>
+            </w:tcMar>
+          </w:tcPr>
+          <w:p>
+            <w:r>
+              <w:rPr>
+                <w:rFonts w:ascii="Calibri" w:cs="Calibri" w:eastAsia="Calibri" w:hAnsi="Calibri"/>
+                <w:b/>
+                <w:bCs/>
+                <w:sz w:val="19"/>
+                <w:szCs w:val="19"/>
+              </w:rPr>
+              <w:t xml:space="preserve">N</w:t>
+            </w:r>
+          </w:p>
+        </w:tc>
+        <w:tc>
+          <w:tcPr>
+            <w:tcW w:type="dxa" w:w="1400"/>
+            <w:shd w:fill="E8EEF7" w:val="clear"/>
+            <w:tcMar>
+              <w:top w:type="dxa" w:w="60"/>
+              <w:left w:type="dxa" w:w="100"/>
+              <w:bottom w:type="dxa" w:w="60"/>
+              <w:right w:type="dxa" w:w="100"/>
+            </w:tcMar>
+          </w:tcPr>
+          <w:p>
+            <w:r>
+              <w:rPr>
+                <w:rFonts w:ascii="Calibri" w:cs="Calibri" w:eastAsia="Calibri" w:hAnsi="Calibri"/>
+                <w:b/>
+                <w:bCs/>
+                <w:sz w:val="19"/>
+                <w:szCs w:val="19"/>
+              </w:rPr>
+              <w:t xml:space="preserve">β/SD</w:t>
+            </w:r>
+          </w:p>
+        </w:tc>
+        <w:tc>
+          <w:tcPr>
+            <w:tcW w:type="dxa" w:w="2560"/>
+            <w:shd w:fill="E8EEF7" w:val="clear"/>
+            <w:tcMar>
+              <w:top w:type="dxa" w:w="60"/>
+              <w:left w:type="dxa" w:w="100"/>
+              <w:bottom w:type="dxa" w:w="60"/>
+              <w:right w:type="dxa" w:w="100"/>
+            </w:tcMar>
+          </w:tcPr>
+          <w:p>
+            <w:r>
+              <w:rPr>
+                <w:rFonts w:ascii="Calibri" w:cs="Calibri" w:eastAsia="Calibri" w:hAnsi="Calibri"/>
+                <w:b/>
+                <w:bCs/>
+                <w:sz w:val="19"/>
+                <w:szCs w:val="19"/>
+              </w:rPr>
+              <w:t xml:space="preserve">IC 95%</w:t>
+            </w:r>
+          </w:p>
+        </w:tc>
+        <w:tc>
+          <w:tcPr>
+            <w:tcW w:type="dxa" w:w="2000"/>
+            <w:shd w:fill="E8EEF7" w:val="clear"/>
+            <w:tcMar>
+              <w:top w:type="dxa" w:w="60"/>
+              <w:left w:type="dxa" w:w="100"/>
+              <w:bottom w:type="dxa" w:w="60"/>
+              <w:right w:type="dxa" w:w="100"/>
+            </w:tcMar>
+          </w:tcPr>
+          <w:p>
+            <w:r>
+              <w:rPr>
+                <w:rFonts w:ascii="Calibri" w:cs="Calibri" w:eastAsia="Calibri" w:hAnsi="Calibri"/>
+                <w:b/>
+                <w:bCs/>
+                <w:sz w:val="19"/>
+                <w:szCs w:val="19"/>
+              </w:rPr>
+              <w:t xml:space="preserve">p</w:t>
+            </w:r>
+          </w:p>
+        </w:tc>
+      </w:tr>
+      <w:tr>
+        <w:tc>
+          <w:tcPr>
+            <w:tcW w:type="dxa" w:w="2100"/>
+            <w:tcMar>
+              <w:top w:type="dxa" w:w="60"/>
+              <w:left w:type="dxa" w:w="100"/>
+              <w:bottom w:type="dxa" w:w="60"/>
+              <w:right w:type="dxa" w:w="100"/>
+            </w:tcMar>
+          </w:tcPr>
+          <w:p>
+            <w:r>
+              <w:rPr>
+                <w:rFonts w:ascii="Calibri" w:cs="Calibri" w:eastAsia="Calibri" w:hAnsi="Calibri"/>
+                <w:sz w:val="19"/>
+                <w:szCs w:val="19"/>
+              </w:rPr>
+              <w:t xml:space="preserve">Uruguay</w:t>
+            </w:r>
+          </w:p>
+        </w:tc>
+        <w:tc>
+          <w:tcPr>
+            <w:tcW w:type="dxa" w:w="1300"/>
+            <w:tcMar>
+              <w:top w:type="dxa" w:w="60"/>
+              <w:left w:type="dxa" w:w="100"/>
+              <w:bottom w:type="dxa" w:w="60"/>
+              <w:right w:type="dxa" w:w="100"/>
+            </w:tcMar>
+          </w:tcPr>
+          <w:p>
+            <w:r>
+              <w:rPr>
+                <w:rFonts w:ascii="Calibri" w:cs="Calibri" w:eastAsia="Calibri" w:hAnsi="Calibri"/>
+                <w:sz w:val="19"/>
+                <w:szCs w:val="19"/>
+              </w:rPr>
+              <w:t xml:space="preserve">6.524</w:t>
+            </w:r>
+          </w:p>
+        </w:tc>
+        <w:tc>
+          <w:tcPr>
+            <w:tcW w:type="dxa" w:w="1400"/>
+            <w:tcMar>
+              <w:top w:type="dxa" w:w="60"/>
+              <w:left w:type="dxa" w:w="100"/>
+              <w:bottom w:type="dxa" w:w="60"/>
+              <w:right w:type="dxa" w:w="100"/>
+            </w:tcMar>
+          </w:tcPr>
+          <w:p>
+            <w:r>
+              <w:rPr>
+                <w:rFonts w:ascii="Calibri" w:cs="Calibri" w:eastAsia="Calibri" w:hAnsi="Calibri"/>
+                <w:sz w:val="19"/>
+                <w:szCs w:val="19"/>
+              </w:rPr>
+              <w:t xml:space="preserve">−0.71</w:t>
+            </w:r>
+          </w:p>
+        </w:tc>
+        <w:tc>
+          <w:tcPr>
+            <w:tcW w:type="dxa" w:w="2560"/>
+            <w:tcMar>
+              <w:top w:type="dxa" w:w="60"/>
+              <w:left w:type="dxa" w:w="100"/>
+              <w:bottom w:type="dxa" w:w="60"/>
+              <w:right w:type="dxa" w:w="100"/>
+            </w:tcMar>
+          </w:tcPr>
+          <w:p>
+            <w:r>
+              <w:rPr>
+                <w:rFonts w:ascii="Calibri" w:cs="Calibri" w:eastAsia="Calibri" w:hAnsi="Calibri"/>
+                <w:sz w:val="19"/>
+                <w:szCs w:val="19"/>
+              </w:rPr>
+              <w:t xml:space="preserve">[−0.92, −0.50]</w:t>
+            </w:r>
+          </w:p>
+        </w:tc>
+        <w:tc>
+          <w:tcPr>
+            <w:tcW w:type="dxa" w:w="2000"/>
+            <w:tcMar>
+              <w:top w:type="dxa" w:w="60"/>
+              <w:left w:type="dxa" w:w="100"/>
+              <w:bottom w:type="dxa" w:w="60"/>
+              <w:right w:type="dxa" w:w="100"/>
+            </w:tcMar>
+          </w:tcPr>
+          <w:p>
+            <w:r>
+              <w:rPr>
+                <w:rFonts w:ascii="Calibri" w:cs="Calibri" w:eastAsia="Calibri" w:hAnsi="Calibri"/>
+                <w:sz w:val="19"/>
+                <w:szCs w:val="19"/>
+              </w:rPr>
+              <w:t xml:space="preserve">&lt;0.001</w:t>
+            </w:r>
+          </w:p>
+        </w:tc>
+      </w:tr>
+      <w:tr>
+        <w:tc>
+          <w:tcPr>
+            <w:tcW w:type="dxa" w:w="2100"/>
+            <w:tcMar>
+              <w:top w:type="dxa" w:w="60"/>
+              <w:left w:type="dxa" w:w="100"/>
+              <w:bottom w:type="dxa" w:w="60"/>
+              <w:right w:type="dxa" w:w="100"/>
+            </w:tcMar>
+          </w:tcPr>
+          <w:p>
+            <w:r>
+              <w:rPr>
+                <w:rFonts w:ascii="Calibri" w:cs="Calibri" w:eastAsia="Calibri" w:hAnsi="Calibri"/>
+                <w:sz w:val="19"/>
+                <w:szCs w:val="19"/>
+              </w:rPr>
+              <w:t xml:space="preserve">Bolivia</w:t>
+            </w:r>
+          </w:p>
+        </w:tc>
+        <w:tc>
+          <w:tcPr>
+            <w:tcW w:type="dxa" w:w="1300"/>
+            <w:tcMar>
+              <w:top w:type="dxa" w:w="60"/>
+              <w:left w:type="dxa" w:w="100"/>
+              <w:bottom w:type="dxa" w:w="60"/>
+              <w:right w:type="dxa" w:w="100"/>
+            </w:tcMar>
+          </w:tcPr>
+          <w:p>
+            <w:r>
+              <w:rPr>
+                <w:rFonts w:ascii="Calibri" w:cs="Calibri" w:eastAsia="Calibri" w:hAnsi="Calibri"/>
+                <w:sz w:val="19"/>
+                <w:szCs w:val="19"/>
+              </w:rPr>
+              <w:t xml:space="preserve">9.547</w:t>
+            </w:r>
+          </w:p>
+        </w:tc>
+        <w:tc>
+          <w:tcPr>
+            <w:tcW w:type="dxa" w:w="1400"/>
+            <w:tcMar>
+              <w:top w:type="dxa" w:w="60"/>
+              <w:left w:type="dxa" w:w="100"/>
+              <w:bottom w:type="dxa" w:w="60"/>
+              <w:right w:type="dxa" w:w="100"/>
+            </w:tcMar>
+          </w:tcPr>
+          <w:p>
+            <w:r>
+              <w:rPr>
+                <w:rFonts w:ascii="Calibri" w:cs="Calibri" w:eastAsia="Calibri" w:hAnsi="Calibri"/>
+                <w:sz w:val="19"/>
+                <w:szCs w:val="19"/>
+              </w:rPr>
+              <w:t xml:space="preserve">−0.53</w:t>
+            </w:r>
+          </w:p>
+        </w:tc>
+        <w:tc>
+          <w:tcPr>
+            <w:tcW w:type="dxa" w:w="2560"/>
+            <w:tcMar>
+              <w:top w:type="dxa" w:w="60"/>
+              <w:left w:type="dxa" w:w="100"/>
+              <w:bottom w:type="dxa" w:w="60"/>
+              <w:right w:type="dxa" w:w="100"/>
+            </w:tcMar>
+          </w:tcPr>
+          <w:p>
+            <w:r>
+              <w:rPr>
+                <w:rFonts w:ascii="Calibri" w:cs="Calibri" w:eastAsia="Calibri" w:hAnsi="Calibri"/>
+                <w:sz w:val="19"/>
+                <w:szCs w:val="19"/>
+              </w:rPr>
+              <w:t xml:space="preserve">[−0.76, −0.30]</w:t>
+            </w:r>
+          </w:p>
+        </w:tc>
+        <w:tc>
+          <w:tcPr>
+            <w:tcW w:type="dxa" w:w="2000"/>
+            <w:tcMar>
+              <w:top w:type="dxa" w:w="60"/>
+              <w:left w:type="dxa" w:w="100"/>
+              <w:bottom w:type="dxa" w:w="60"/>
+              <w:right w:type="dxa" w:w="100"/>
+            </w:tcMar>
+          </w:tcPr>
+          <w:p>
+            <w:r>
+              <w:rPr>
+                <w:rFonts w:ascii="Calibri" w:cs="Calibri" w:eastAsia="Calibri" w:hAnsi="Calibri"/>
+                <w:sz w:val="19"/>
+                <w:szCs w:val="19"/>
+              </w:rPr>
+              <w:t xml:space="preserve">&lt;0.001</w:t>
+            </w:r>
+          </w:p>
+        </w:tc>
+      </w:tr>
+      <w:tr>
+        <w:tc>
+          <w:tcPr>
+            <w:tcW w:type="dxa" w:w="2100"/>
+            <w:tcMar>
+              <w:top w:type="dxa" w:w="60"/>
+              <w:left w:type="dxa" w:w="100"/>
+              <w:bottom w:type="dxa" w:w="60"/>
+              <w:right w:type="dxa" w:w="100"/>
+            </w:tcMar>
+          </w:tcPr>
+          <w:p>
+            <w:r>
+              <w:rPr>
+                <w:rFonts w:ascii="Calibri" w:cs="Calibri" w:eastAsia="Calibri" w:hAnsi="Calibri"/>
+                <w:sz w:val="19"/>
+                <w:szCs w:val="19"/>
+              </w:rPr>
+              <w:t xml:space="preserve">Surinam</w:t>
+            </w:r>
+          </w:p>
+        </w:tc>
+        <w:tc>
+          <w:tcPr>
+            <w:tcW w:type="dxa" w:w="1300"/>
+            <w:tcMar>
+              <w:top w:type="dxa" w:w="60"/>
+              <w:left w:type="dxa" w:w="100"/>
+              <w:bottom w:type="dxa" w:w="60"/>
+              <w:right w:type="dxa" w:w="100"/>
+            </w:tcMar>
+          </w:tcPr>
+          <w:p>
+            <w:r>
+              <w:rPr>
+                <w:rFonts w:ascii="Calibri" w:cs="Calibri" w:eastAsia="Calibri" w:hAnsi="Calibri"/>
+                <w:sz w:val="19"/>
+                <w:szCs w:val="19"/>
+              </w:rPr>
+              <w:t xml:space="preserve">5.527</w:t>
+            </w:r>
+          </w:p>
+        </w:tc>
+        <w:tc>
+          <w:tcPr>
+            <w:tcW w:type="dxa" w:w="1400"/>
+            <w:tcMar>
+              <w:top w:type="dxa" w:w="60"/>
+              <w:left w:type="dxa" w:w="100"/>
+              <w:bottom w:type="dxa" w:w="60"/>
+              <w:right w:type="dxa" w:w="100"/>
+            </w:tcMar>
+          </w:tcPr>
+          <w:p>
+            <w:r>
+              <w:rPr>
+                <w:rFonts w:ascii="Calibri" w:cs="Calibri" w:eastAsia="Calibri" w:hAnsi="Calibri"/>
+                <w:sz w:val="19"/>
+                <w:szCs w:val="19"/>
+              </w:rPr>
+              <w:t xml:space="preserve">−0.29</w:t>
+            </w:r>
+          </w:p>
+        </w:tc>
+        <w:tc>
+          <w:tcPr>
+            <w:tcW w:type="dxa" w:w="2560"/>
+            <w:tcMar>
+              <w:top w:type="dxa" w:w="60"/>
+              <w:left w:type="dxa" w:w="100"/>
+              <w:bottom w:type="dxa" w:w="60"/>
+              <w:right w:type="dxa" w:w="100"/>
+            </w:tcMar>
+          </w:tcPr>
+          <w:p>
+            <w:r>
+              <w:rPr>
+                <w:rFonts w:ascii="Calibri" w:cs="Calibri" w:eastAsia="Calibri" w:hAnsi="Calibri"/>
+                <w:sz w:val="19"/>
+                <w:szCs w:val="19"/>
+              </w:rPr>
+              <w:t xml:space="preserve">[−0.46, −0.12]</w:t>
+            </w:r>
+          </w:p>
+        </w:tc>
+        <w:tc>
+          <w:tcPr>
+            <w:tcW w:type="dxa" w:w="2000"/>
+            <w:tcMar>
+              <w:top w:type="dxa" w:w="60"/>
+              <w:left w:type="dxa" w:w="100"/>
+              <w:bottom w:type="dxa" w:w="60"/>
+              <w:right w:type="dxa" w:w="100"/>
+            </w:tcMar>
+          </w:tcPr>
+          <w:p>
+            <w:r>
+              <w:rPr>
+                <w:rFonts w:ascii="Calibri" w:cs="Calibri" w:eastAsia="Calibri" w:hAnsi="Calibri"/>
+                <w:sz w:val="19"/>
+                <w:szCs w:val="19"/>
+              </w:rPr>
+              <w:t xml:space="preserve">0.001</w:t>
+            </w:r>
+          </w:p>
+        </w:tc>
+      </w:tr>
+      <w:tr>
+        <w:tc>
+          <w:tcPr>
+            <w:tcW w:type="dxa" w:w="2100"/>
+            <w:tcMar>
+              <w:top w:type="dxa" w:w="60"/>
+              <w:left w:type="dxa" w:w="100"/>
+              <w:bottom w:type="dxa" w:w="60"/>
+              <w:right w:type="dxa" w:w="100"/>
+            </w:tcMar>
+          </w:tcPr>
+          <w:p>
+            <w:r>
+              <w:rPr>
+                <w:rFonts w:ascii="Calibri" w:cs="Calibri" w:eastAsia="Calibri" w:hAnsi="Calibri"/>
+                <w:sz w:val="19"/>
+                <w:szCs w:val="19"/>
+              </w:rPr>
+              <w:t xml:space="preserve">Ecuador</w:t>
+            </w:r>
+          </w:p>
+        </w:tc>
+        <w:tc>
+          <w:tcPr>
+            <w:tcW w:type="dxa" w:w="1300"/>
+            <w:tcMar>
+              <w:top w:type="dxa" w:w="60"/>
+              <w:left w:type="dxa" w:w="100"/>
+              <w:bottom w:type="dxa" w:w="60"/>
+              <w:right w:type="dxa" w:w="100"/>
+            </w:tcMar>
+          </w:tcPr>
+          <w:p>
+            <w:r>
+              <w:rPr>
+                <w:rFonts w:ascii="Calibri" w:cs="Calibri" w:eastAsia="Calibri" w:hAnsi="Calibri"/>
+                <w:sz w:val="19"/>
+                <w:szCs w:val="19"/>
+              </w:rPr>
+              <w:t xml:space="preserve">6.955</w:t>
+            </w:r>
+          </w:p>
+        </w:tc>
+        <w:tc>
+          <w:tcPr>
+            <w:tcW w:type="dxa" w:w="1400"/>
+            <w:tcMar>
+              <w:top w:type="dxa" w:w="60"/>
+              <w:left w:type="dxa" w:w="100"/>
+              <w:bottom w:type="dxa" w:w="60"/>
+              <w:right w:type="dxa" w:w="100"/>
+            </w:tcMar>
+          </w:tcPr>
+          <w:p>
+            <w:r>
+              <w:rPr>
+                <w:rFonts w:ascii="Calibri" w:cs="Calibri" w:eastAsia="Calibri" w:hAnsi="Calibri"/>
+                <w:sz w:val="19"/>
+                <w:szCs w:val="19"/>
+              </w:rPr>
+              <w:t xml:space="preserve">−0.27</w:t>
+            </w:r>
+          </w:p>
+        </w:tc>
+        <w:tc>
+          <w:tcPr>
+            <w:tcW w:type="dxa" w:w="2560"/>
+            <w:tcMar>
+              <w:top w:type="dxa" w:w="60"/>
+              <w:left w:type="dxa" w:w="100"/>
+              <w:bottom w:type="dxa" w:w="60"/>
+              <w:right w:type="dxa" w:w="100"/>
+            </w:tcMar>
+          </w:tcPr>
+          <w:p>
+            <w:r>
+              <w:rPr>
+                <w:rFonts w:ascii="Calibri" w:cs="Calibri" w:eastAsia="Calibri" w:hAnsi="Calibri"/>
+                <w:sz w:val="19"/>
+                <w:szCs w:val="19"/>
+              </w:rPr>
+              <w:t xml:space="preserve">[−0.45, −0.08]</w:t>
+            </w:r>
+          </w:p>
+        </w:tc>
+        <w:tc>
+          <w:tcPr>
+            <w:tcW w:type="dxa" w:w="2000"/>
+            <w:tcMar>
+              <w:top w:type="dxa" w:w="60"/>
+              <w:left w:type="dxa" w:w="100"/>
+              <w:bottom w:type="dxa" w:w="60"/>
+              <w:right w:type="dxa" w:w="100"/>
+            </w:tcMar>
+          </w:tcPr>
+          <w:p>
+            <w:r>
+              <w:rPr>
+                <w:rFonts w:ascii="Calibri" w:cs="Calibri" w:eastAsia="Calibri" w:hAnsi="Calibri"/>
+                <w:sz w:val="19"/>
+                <w:szCs w:val="19"/>
+              </w:rPr>
+              <w:t xml:space="preserve">0.006</w:t>
+            </w:r>
+          </w:p>
+        </w:tc>
+      </w:tr>
+      <w:tr>
+        <w:tc>
+          <w:tcPr>
+            <w:tcW w:type="dxa" w:w="2100"/>
+            <w:tcMar>
+              <w:top w:type="dxa" w:w="60"/>
+              <w:left w:type="dxa" w:w="100"/>
+              <w:bottom w:type="dxa" w:w="60"/>
+              <w:right w:type="dxa" w:w="100"/>
+            </w:tcMar>
+          </w:tcPr>
+          <w:p>
+            <w:r>
+              <w:rPr>
+                <w:rFonts w:ascii="Calibri" w:cs="Calibri" w:eastAsia="Calibri" w:hAnsi="Calibri"/>
+                <w:sz w:val="19"/>
+                <w:szCs w:val="19"/>
+              </w:rPr>
+              <w:t xml:space="preserve">Argentina</w:t>
+            </w:r>
+          </w:p>
+        </w:tc>
+        <w:tc>
+          <w:tcPr>
+            <w:tcW w:type="dxa" w:w="1300"/>
+            <w:tcMar>
+              <w:top w:type="dxa" w:w="60"/>
+              <w:left w:type="dxa" w:w="100"/>
+              <w:bottom w:type="dxa" w:w="60"/>
+              <w:right w:type="dxa" w:w="100"/>
+            </w:tcMar>
+          </w:tcPr>
+          <w:p>
+            <w:r>
+              <w:rPr>
+                <w:rFonts w:ascii="Calibri" w:cs="Calibri" w:eastAsia="Calibri" w:hAnsi="Calibri"/>
+                <w:sz w:val="19"/>
+                <w:szCs w:val="19"/>
+              </w:rPr>
+              <w:t xml:space="preserve">5.807</w:t>
+            </w:r>
+          </w:p>
+        </w:tc>
+        <w:tc>
+          <w:tcPr>
+            <w:tcW w:type="dxa" w:w="1400"/>
+            <w:tcMar>
+              <w:top w:type="dxa" w:w="60"/>
+              <w:left w:type="dxa" w:w="100"/>
+              <w:bottom w:type="dxa" w:w="60"/>
+              <w:right w:type="dxa" w:w="100"/>
+            </w:tcMar>
+          </w:tcPr>
+          <w:p>
+            <w:r>
+              <w:rPr>
+                <w:rFonts w:ascii="Calibri" w:cs="Calibri" w:eastAsia="Calibri" w:hAnsi="Calibri"/>
+                <w:sz w:val="19"/>
+                <w:szCs w:val="19"/>
+              </w:rPr>
+              <w:t xml:space="preserve">−0.16</w:t>
+            </w:r>
+          </w:p>
+        </w:tc>
+        <w:tc>
+          <w:tcPr>
+            <w:tcW w:type="dxa" w:w="2560"/>
+            <w:tcMar>
+              <w:top w:type="dxa" w:w="60"/>
+              <w:left w:type="dxa" w:w="100"/>
+              <w:bottom w:type="dxa" w:w="60"/>
+              <w:right w:type="dxa" w:w="100"/>
+            </w:tcMar>
+          </w:tcPr>
+          <w:p>
+            <w:r>
+              <w:rPr>
+                <w:rFonts w:ascii="Calibri" w:cs="Calibri" w:eastAsia="Calibri" w:hAnsi="Calibri"/>
+                <w:sz w:val="19"/>
+                <w:szCs w:val="19"/>
+              </w:rPr>
+              <w:t xml:space="preserve">[−0.35, +0.03]</w:t>
+            </w:r>
+          </w:p>
+        </w:tc>
+        <w:tc>
+          <w:tcPr>
+            <w:tcW w:type="dxa" w:w="2000"/>
+            <w:tcMar>
+              <w:top w:type="dxa" w:w="60"/>
+              <w:left w:type="dxa" w:w="100"/>
+              <w:bottom w:type="dxa" w:w="60"/>
+              <w:right w:type="dxa" w:w="100"/>
+            </w:tcMar>
+          </w:tcPr>
+          <w:p>
+            <w:r>
+              <w:rPr>
+                <w:rFonts w:ascii="Calibri" w:cs="Calibri" w:eastAsia="Calibri" w:hAnsi="Calibri"/>
+                <w:sz w:val="19"/>
+                <w:szCs w:val="19"/>
+              </w:rPr>
+              <w:t xml:space="preserve">0.104</w:t>
+            </w:r>
+          </w:p>
+        </w:tc>
+      </w:tr>
+      <w:tr>
+        <w:tc>
+          <w:tcPr>
+            <w:tcW w:type="dxa" w:w="2100"/>
+            <w:tcMar>
+              <w:top w:type="dxa" w:w="60"/>
+              <w:left w:type="dxa" w:w="100"/>
+              <w:bottom w:type="dxa" w:w="60"/>
+              <w:right w:type="dxa" w:w="100"/>
+            </w:tcMar>
+          </w:tcPr>
+          <w:p>
+            <w:r>
+              <w:rPr>
+                <w:rFonts w:ascii="Calibri" w:cs="Calibri" w:eastAsia="Calibri" w:hAnsi="Calibri"/>
+                <w:sz w:val="19"/>
+                <w:szCs w:val="19"/>
+              </w:rPr>
+              <w:t xml:space="preserve">Perú</w:t>
+            </w:r>
+          </w:p>
+        </w:tc>
+        <w:tc>
+          <w:tcPr>
+            <w:tcW w:type="dxa" w:w="1300"/>
+            <w:tcMar>
+              <w:top w:type="dxa" w:w="60"/>
+              <w:left w:type="dxa" w:w="100"/>
+              <w:bottom w:type="dxa" w:w="60"/>
+              <w:right w:type="dxa" w:w="100"/>
+            </w:tcMar>
+          </w:tcPr>
+          <w:p>
+            <w:r>
+              <w:rPr>
+                <w:rFonts w:ascii="Calibri" w:cs="Calibri" w:eastAsia="Calibri" w:hAnsi="Calibri"/>
+                <w:sz w:val="19"/>
+                <w:szCs w:val="19"/>
+              </w:rPr>
+              <w:t xml:space="preserve">6.807</w:t>
+            </w:r>
+          </w:p>
+        </w:tc>
+        <w:tc>
+          <w:tcPr>
+            <w:tcW w:type="dxa" w:w="1400"/>
+            <w:tcMar>
+              <w:top w:type="dxa" w:w="60"/>
+              <w:left w:type="dxa" w:w="100"/>
+              <w:bottom w:type="dxa" w:w="60"/>
+              <w:right w:type="dxa" w:w="100"/>
+            </w:tcMar>
+          </w:tcPr>
+          <w:p>
+            <w:r>
+              <w:rPr>
+                <w:rFonts w:ascii="Calibri" w:cs="Calibri" w:eastAsia="Calibri" w:hAnsi="Calibri"/>
+                <w:sz w:val="19"/>
+                <w:szCs w:val="19"/>
+              </w:rPr>
+              <w:t xml:space="preserve">−0.09</w:t>
+            </w:r>
+          </w:p>
+        </w:tc>
+        <w:tc>
+          <w:tcPr>
+            <w:tcW w:type="dxa" w:w="2560"/>
+            <w:tcMar>
+              <w:top w:type="dxa" w:w="60"/>
+              <w:left w:type="dxa" w:w="100"/>
+              <w:bottom w:type="dxa" w:w="60"/>
+              <w:right w:type="dxa" w:w="100"/>
+            </w:tcMar>
+          </w:tcPr>
+          <w:p>
+            <w:r>
+              <w:rPr>
+                <w:rFonts w:ascii="Calibri" w:cs="Calibri" w:eastAsia="Calibri" w:hAnsi="Calibri"/>
+                <w:sz w:val="19"/>
+                <w:szCs w:val="19"/>
+              </w:rPr>
+              <w:t xml:space="preserve">[−0.27, +0.09]</w:t>
+            </w:r>
+          </w:p>
+        </w:tc>
+        <w:tc>
+          <w:tcPr>
+            <w:tcW w:type="dxa" w:w="2000"/>
+            <w:tcMar>
+              <w:top w:type="dxa" w:w="60"/>
+              <w:left w:type="dxa" w:w="100"/>
+              <w:bottom w:type="dxa" w:w="60"/>
+              <w:right w:type="dxa" w:w="100"/>
+            </w:tcMar>
+          </w:tcPr>
+          <w:p>
+            <w:r>
+              <w:rPr>
+                <w:rFonts w:ascii="Calibri" w:cs="Calibri" w:eastAsia="Calibri" w:hAnsi="Calibri"/>
+                <w:sz w:val="19"/>
+                <w:szCs w:val="19"/>
+              </w:rPr>
+              <w:t xml:space="preserve">0.313</w:t>
+            </w:r>
+          </w:p>
+        </w:tc>
+      </w:tr>
+      <w:tr>
+        <w:tc>
+          <w:tcPr>
+            <w:tcW w:type="dxa" w:w="2100"/>
+            <w:tcMar>
+              <w:top w:type="dxa" w:w="60"/>
+              <w:left w:type="dxa" w:w="100"/>
+              <w:bottom w:type="dxa" w:w="60"/>
+              <w:right w:type="dxa" w:w="100"/>
+            </w:tcMar>
+          </w:tcPr>
+          <w:p>
+            <w:r>
+              <w:rPr>
+                <w:rFonts w:ascii="Calibri" w:cs="Calibri" w:eastAsia="Calibri" w:hAnsi="Calibri"/>
+                <w:sz w:val="19"/>
+                <w:szCs w:val="19"/>
+              </w:rPr>
+              <w:t xml:space="preserve">Colombia</w:t>
+            </w:r>
+          </w:p>
+        </w:tc>
+        <w:tc>
+          <w:tcPr>
+            <w:tcW w:type="dxa" w:w="1300"/>
+            <w:tcMar>
+              <w:top w:type="dxa" w:w="60"/>
+              <w:left w:type="dxa" w:w="100"/>
+              <w:bottom w:type="dxa" w:w="60"/>
+              <w:right w:type="dxa" w:w="100"/>
+            </w:tcMar>
+          </w:tcPr>
+          <w:p>
+            <w:r>
+              <w:rPr>
+                <w:rFonts w:ascii="Calibri" w:cs="Calibri" w:eastAsia="Calibri" w:hAnsi="Calibri"/>
+                <w:sz w:val="19"/>
+                <w:szCs w:val="19"/>
+              </w:rPr>
+              <w:t xml:space="preserve">5.893</w:t>
+            </w:r>
+          </w:p>
+        </w:tc>
+        <w:tc>
+          <w:tcPr>
+            <w:tcW w:type="dxa" w:w="1400"/>
+            <w:tcMar>
+              <w:top w:type="dxa" w:w="60"/>
+              <w:left w:type="dxa" w:w="100"/>
+              <w:bottom w:type="dxa" w:w="60"/>
+              <w:right w:type="dxa" w:w="100"/>
+            </w:tcMar>
+          </w:tcPr>
+          <w:p>
+            <w:r>
+              <w:rPr>
+                <w:rFonts w:ascii="Calibri" w:cs="Calibri" w:eastAsia="Calibri" w:hAnsi="Calibri"/>
+                <w:sz w:val="19"/>
+                <w:szCs w:val="19"/>
+              </w:rPr>
+              <w:t xml:space="preserve">−0.01</w:t>
+            </w:r>
+          </w:p>
+        </w:tc>
+        <w:tc>
+          <w:tcPr>
+            <w:tcW w:type="dxa" w:w="2560"/>
+            <w:tcMar>
+              <w:top w:type="dxa" w:w="60"/>
+              <w:left w:type="dxa" w:w="100"/>
+              <w:bottom w:type="dxa" w:w="60"/>
+              <w:right w:type="dxa" w:w="100"/>
+            </w:tcMar>
+          </w:tcPr>
+          <w:p>
+            <w:r>
+              <w:rPr>
+                <w:rFonts w:ascii="Calibri" w:cs="Calibri" w:eastAsia="Calibri" w:hAnsi="Calibri"/>
+                <w:sz w:val="19"/>
+                <w:szCs w:val="19"/>
+              </w:rPr>
+              <w:t xml:space="preserve">[−0.16, +0.14]</w:t>
+            </w:r>
+          </w:p>
+        </w:tc>
+        <w:tc>
+          <w:tcPr>
+            <w:tcW w:type="dxa" w:w="2000"/>
+            <w:tcMar>
+              <w:top w:type="dxa" w:w="60"/>
+              <w:left w:type="dxa" w:w="100"/>
+              <w:bottom w:type="dxa" w:w="60"/>
+              <w:right w:type="dxa" w:w="100"/>
+            </w:tcMar>
+          </w:tcPr>
+          <w:p>
+            <w:r>
+              <w:rPr>
+                <w:rFonts w:ascii="Calibri" w:cs="Calibri" w:eastAsia="Calibri" w:hAnsi="Calibri"/>
+                <w:sz w:val="19"/>
+                <w:szCs w:val="19"/>
+              </w:rPr>
+              <w:t xml:space="preserve">0.903</w:t>
+            </w:r>
+          </w:p>
+        </w:tc>
+      </w:tr>
+      <w:tr>
+        <w:tc>
+          <w:tcPr>
+            <w:tcW w:type="dxa" w:w="2100"/>
+            <w:tcMar>
+              <w:top w:type="dxa" w:w="60"/>
+              <w:left w:type="dxa" w:w="100"/>
+              <w:bottom w:type="dxa" w:w="60"/>
+              <w:right w:type="dxa" w:w="100"/>
+            </w:tcMar>
+          </w:tcPr>
+          <w:p>
+            <w:r>
+              <w:rPr>
+                <w:rFonts w:ascii="Calibri" w:cs="Calibri" w:eastAsia="Calibri" w:hAnsi="Calibri"/>
+                <w:sz w:val="19"/>
+                <w:szCs w:val="19"/>
+              </w:rPr>
+              <w:t xml:space="preserve">Venezuela</w:t>
+            </w:r>
+          </w:p>
+        </w:tc>
+        <w:tc>
+          <w:tcPr>
+            <w:tcW w:type="dxa" w:w="1300"/>
+            <w:tcMar>
+              <w:top w:type="dxa" w:w="60"/>
+              <w:left w:type="dxa" w:w="100"/>
+              <w:bottom w:type="dxa" w:w="60"/>
+              <w:right w:type="dxa" w:w="100"/>
+            </w:tcMar>
+          </w:tcPr>
+          <w:p>
+            <w:r>
+              <w:rPr>
+                <w:rFonts w:ascii="Calibri" w:cs="Calibri" w:eastAsia="Calibri" w:hAnsi="Calibri"/>
+                <w:sz w:val="19"/>
+                <w:szCs w:val="19"/>
+              </w:rPr>
+              <w:t xml:space="preserve">5.002</w:t>
+            </w:r>
+          </w:p>
+        </w:tc>
+        <w:tc>
+          <w:tcPr>
+            <w:tcW w:type="dxa" w:w="1400"/>
+            <w:tcMar>
+              <w:top w:type="dxa" w:w="60"/>
+              <w:left w:type="dxa" w:w="100"/>
+              <w:bottom w:type="dxa" w:w="60"/>
+              <w:right w:type="dxa" w:w="100"/>
+            </w:tcMar>
+          </w:tcPr>
+          <w:p>
+            <w:r>
+              <w:rPr>
+                <w:rFonts w:ascii="Calibri" w:cs="Calibri" w:eastAsia="Calibri" w:hAnsi="Calibri"/>
+                <w:sz w:val="19"/>
+                <w:szCs w:val="19"/>
+              </w:rPr>
+              <w:t xml:space="preserve">−0.00</w:t>
+            </w:r>
+          </w:p>
+        </w:tc>
+        <w:tc>
+          <w:tcPr>
+            <w:tcW w:type="dxa" w:w="2560"/>
+            <w:tcMar>
+              <w:top w:type="dxa" w:w="60"/>
+              <w:left w:type="dxa" w:w="100"/>
+              <w:bottom w:type="dxa" w:w="60"/>
+              <w:right w:type="dxa" w:w="100"/>
+            </w:tcMar>
+          </w:tcPr>
+          <w:p>
+            <w:r>
+              <w:rPr>
+                <w:rFonts w:ascii="Calibri" w:cs="Calibri" w:eastAsia="Calibri" w:hAnsi="Calibri"/>
+                <w:sz w:val="19"/>
+                <w:szCs w:val="19"/>
+              </w:rPr>
+              <w:t xml:space="preserve">[−0.15, +0.15]</w:t>
+            </w:r>
+          </w:p>
+        </w:tc>
+        <w:tc>
+          <w:tcPr>
+            <w:tcW w:type="dxa" w:w="2000"/>
+            <w:tcMar>
+              <w:top w:type="dxa" w:w="60"/>
+              <w:left w:type="dxa" w:w="100"/>
+              <w:bottom w:type="dxa" w:w="60"/>
+              <w:right w:type="dxa" w:w="100"/>
+            </w:tcMar>
+          </w:tcPr>
+          <w:p>
+            <w:r>
+              <w:rPr>
+                <w:rFonts w:ascii="Calibri" w:cs="Calibri" w:eastAsia="Calibri" w:hAnsi="Calibri"/>
+                <w:sz w:val="19"/>
+                <w:szCs w:val="19"/>
+              </w:rPr>
+              <w:t xml:space="preserve">0.995</w:t>
+            </w:r>
+          </w:p>
+        </w:tc>
+      </w:tr>
+      <w:tr>
+        <w:tc>
+          <w:tcPr>
+            <w:tcW w:type="dxa" w:w="2100"/>
+            <w:tcMar>
+              <w:top w:type="dxa" w:w="60"/>
+              <w:left w:type="dxa" w:w="100"/>
+              <w:bottom w:type="dxa" w:w="60"/>
+              <w:right w:type="dxa" w:w="100"/>
+            </w:tcMar>
+          </w:tcPr>
+          <w:p>
+            <w:r>
+              <w:rPr>
+                <w:rFonts w:ascii="Calibri" w:cs="Calibri" w:eastAsia="Calibri" w:hAnsi="Calibri"/>
+                <w:sz w:val="19"/>
+                <w:szCs w:val="19"/>
+              </w:rPr>
+              <w:t xml:space="preserve">Paraguay</w:t>
+            </w:r>
+          </w:p>
+        </w:tc>
+        <w:tc>
+          <w:tcPr>
+            <w:tcW w:type="dxa" w:w="1300"/>
+            <w:tcMar>
+              <w:top w:type="dxa" w:w="60"/>
+              <w:left w:type="dxa" w:w="100"/>
+              <w:bottom w:type="dxa" w:w="60"/>
+              <w:right w:type="dxa" w:w="100"/>
+            </w:tcMar>
+          </w:tcPr>
+          <w:p>
+            <w:r>
+              <w:rPr>
+                <w:rFonts w:ascii="Calibri" w:cs="Calibri" w:eastAsia="Calibri" w:hAnsi="Calibri"/>
+                <w:sz w:val="19"/>
+                <w:szCs w:val="19"/>
+              </w:rPr>
+              <w:t xml:space="preserve">5.858</w:t>
+            </w:r>
+          </w:p>
+        </w:tc>
+        <w:tc>
+          <w:tcPr>
+            <w:tcW w:type="dxa" w:w="1400"/>
+            <w:tcMar>
+              <w:top w:type="dxa" w:w="60"/>
+              <w:left w:type="dxa" w:w="100"/>
+              <w:bottom w:type="dxa" w:w="60"/>
+              <w:right w:type="dxa" w:w="100"/>
+            </w:tcMar>
+          </w:tcPr>
+          <w:p>
+            <w:r>
+              <w:rPr>
+                <w:rFonts w:ascii="Calibri" w:cs="Calibri" w:eastAsia="Calibri" w:hAnsi="Calibri"/>
+                <w:sz w:val="19"/>
+                <w:szCs w:val="19"/>
+              </w:rPr>
+              <w:t xml:space="preserve">+0.02</w:t>
+            </w:r>
+          </w:p>
+        </w:tc>
+        <w:tc>
+          <w:tcPr>
+            <w:tcW w:type="dxa" w:w="2560"/>
+            <w:tcMar>
+              <w:top w:type="dxa" w:w="60"/>
+              <w:left w:type="dxa" w:w="100"/>
+              <w:bottom w:type="dxa" w:w="60"/>
+              <w:right w:type="dxa" w:w="100"/>
+            </w:tcMar>
+          </w:tcPr>
+          <w:p>
+            <w:r>
+              <w:rPr>
+                <w:rFonts w:ascii="Calibri" w:cs="Calibri" w:eastAsia="Calibri" w:hAnsi="Calibri"/>
+                <w:sz w:val="19"/>
+                <w:szCs w:val="19"/>
+              </w:rPr>
+              <w:t xml:space="preserve">[−0.12, +0.17]</w:t>
+            </w:r>
+          </w:p>
+        </w:tc>
+        <w:tc>
+          <w:tcPr>
+            <w:tcW w:type="dxa" w:w="2000"/>
+            <w:tcMar>
+              <w:top w:type="dxa" w:w="60"/>
+              <w:left w:type="dxa" w:w="100"/>
+              <w:bottom w:type="dxa" w:w="60"/>
+              <w:right w:type="dxa" w:w="100"/>
+            </w:tcMar>
+          </w:tcPr>
+          <w:p>
+            <w:r>
+              <w:rPr>
+                <w:rFonts w:ascii="Calibri" w:cs="Calibri" w:eastAsia="Calibri" w:hAnsi="Calibri"/>
+                <w:sz w:val="19"/>
+                <w:szCs w:val="19"/>
+              </w:rPr>
+              <w:t xml:space="preserve">0.736</w:t>
+            </w:r>
+          </w:p>
+        </w:tc>
+      </w:tr>
+      <w:tr>
+        <w:tc>
+          <w:tcPr>
+            <w:tcW w:type="dxa" w:w="2100"/>
+            <w:tcMar>
+              <w:top w:type="dxa" w:w="60"/>
+              <w:left w:type="dxa" w:w="100"/>
+              <w:bottom w:type="dxa" w:w="60"/>
+              <w:right w:type="dxa" w:w="100"/>
+            </w:tcMar>
+          </w:tcPr>
+          <w:p>
+            <w:r>
+              <w:rPr>
+                <w:rFonts w:ascii="Calibri" w:cs="Calibri" w:eastAsia="Calibri" w:hAnsi="Calibri"/>
+                <w:sz w:val="19"/>
+                <w:szCs w:val="19"/>
+              </w:rPr>
+              <w:t xml:space="preserve">Brasil</w:t>
+            </w:r>
+          </w:p>
+        </w:tc>
+        <w:tc>
+          <w:tcPr>
+            <w:tcW w:type="dxa" w:w="1300"/>
+            <w:tcMar>
+              <w:top w:type="dxa" w:w="60"/>
+              <w:left w:type="dxa" w:w="100"/>
+              <w:bottom w:type="dxa" w:w="60"/>
+              <w:right w:type="dxa" w:w="100"/>
+            </w:tcMar>
+          </w:tcPr>
+          <w:p>
+            <w:r>
+              <w:rPr>
+                <w:rFonts w:ascii="Calibri" w:cs="Calibri" w:eastAsia="Calibri" w:hAnsi="Calibri"/>
+                <w:sz w:val="19"/>
+                <w:szCs w:val="19"/>
+              </w:rPr>
+              <w:t xml:space="preserve">6.521</w:t>
+            </w:r>
+          </w:p>
+        </w:tc>
+        <w:tc>
+          <w:tcPr>
+            <w:tcW w:type="dxa" w:w="1400"/>
+            <w:tcMar>
+              <w:top w:type="dxa" w:w="60"/>
+              <w:left w:type="dxa" w:w="100"/>
+              <w:bottom w:type="dxa" w:w="60"/>
+              <w:right w:type="dxa" w:w="100"/>
+            </w:tcMar>
+          </w:tcPr>
+          <w:p>
+            <w:r>
+              <w:rPr>
+                <w:rFonts w:ascii="Calibri" w:cs="Calibri" w:eastAsia="Calibri" w:hAnsi="Calibri"/>
+                <w:sz w:val="19"/>
+                <w:szCs w:val="19"/>
+              </w:rPr>
+              <w:t xml:space="preserve">+0.06</w:t>
+            </w:r>
+          </w:p>
+        </w:tc>
+        <w:tc>
+          <w:tcPr>
+            <w:tcW w:type="dxa" w:w="2560"/>
+            <w:tcMar>
+              <w:top w:type="dxa" w:w="60"/>
+              <w:left w:type="dxa" w:w="100"/>
+              <w:bottom w:type="dxa" w:w="60"/>
+              <w:right w:type="dxa" w:w="100"/>
+            </w:tcMar>
+          </w:tcPr>
+          <w:p>
+            <w:r>
+              <w:rPr>
+                <w:rFonts w:ascii="Calibri" w:cs="Calibri" w:eastAsia="Calibri" w:hAnsi="Calibri"/>
+                <w:sz w:val="19"/>
+                <w:szCs w:val="19"/>
+              </w:rPr>
+              <w:t xml:space="preserve">[−0.06, +0.18]</w:t>
+            </w:r>
+          </w:p>
+        </w:tc>
+        <w:tc>
+          <w:tcPr>
+            <w:tcW w:type="dxa" w:w="2000"/>
+            <w:tcMar>
+              <w:top w:type="dxa" w:w="60"/>
+              <w:left w:type="dxa" w:w="100"/>
+              <w:bottom w:type="dxa" w:w="60"/>
+              <w:right w:type="dxa" w:w="100"/>
+            </w:tcMar>
+          </w:tcPr>
+          <w:p>
+            <w:r>
+              <w:rPr>
+                <w:rFonts w:ascii="Calibri" w:cs="Calibri" w:eastAsia="Calibri" w:hAnsi="Calibri"/>
+                <w:sz w:val="19"/>
+                <w:szCs w:val="19"/>
+              </w:rPr>
+              <w:t xml:space="preserve">0.295</w:t>
+            </w:r>
+          </w:p>
+        </w:tc>
+      </w:tr>
+      <w:tr>
+        <w:tc>
+          <w:tcPr>
+            <w:tcW w:type="dxa" w:w="2100"/>
+            <w:tcMar>
+              <w:top w:type="dxa" w:w="60"/>
+              <w:left w:type="dxa" w:w="100"/>
+              <w:bottom w:type="dxa" w:w="60"/>
+              <w:right w:type="dxa" w:w="100"/>
+            </w:tcMar>
+          </w:tcPr>
+          <w:p>
+            <w:r>
+              <w:rPr>
+                <w:rFonts w:ascii="Calibri" w:cs="Calibri" w:eastAsia="Calibri" w:hAnsi="Calibri"/>
+                <w:sz w:val="19"/>
+                <w:szCs w:val="19"/>
+              </w:rPr>
+              <w:t xml:space="preserve">Chile</w:t>
+            </w:r>
+          </w:p>
+        </w:tc>
+        <w:tc>
+          <w:tcPr>
+            <w:tcW w:type="dxa" w:w="1300"/>
+            <w:tcMar>
+              <w:top w:type="dxa" w:w="60"/>
+              <w:left w:type="dxa" w:w="100"/>
+              <w:bottom w:type="dxa" w:w="60"/>
+              <w:right w:type="dxa" w:w="100"/>
+            </w:tcMar>
+          </w:tcPr>
+          <w:p>
+            <w:r>
+              <w:rPr>
+                <w:rFonts w:ascii="Calibri" w:cs="Calibri" w:eastAsia="Calibri" w:hAnsi="Calibri"/>
+                <w:sz w:val="19"/>
+                <w:szCs w:val="19"/>
+              </w:rPr>
+              <w:t xml:space="preserve">7.157</w:t>
+            </w:r>
+          </w:p>
+        </w:tc>
+        <w:tc>
+          <w:tcPr>
+            <w:tcW w:type="dxa" w:w="1400"/>
+            <w:tcMar>
+              <w:top w:type="dxa" w:w="60"/>
+              <w:left w:type="dxa" w:w="100"/>
+              <w:bottom w:type="dxa" w:w="60"/>
+              <w:right w:type="dxa" w:w="100"/>
+            </w:tcMar>
+          </w:tcPr>
+          <w:p>
+            <w:r>
+              <w:rPr>
+                <w:rFonts w:ascii="Calibri" w:cs="Calibri" w:eastAsia="Calibri" w:hAnsi="Calibri"/>
+                <w:sz w:val="19"/>
+                <w:szCs w:val="19"/>
+              </w:rPr>
+              <w:t xml:space="preserve">+0.09</w:t>
+            </w:r>
+          </w:p>
+        </w:tc>
+        <w:tc>
+          <w:tcPr>
+            <w:tcW w:type="dxa" w:w="2560"/>
+            <w:tcMar>
+              <w:top w:type="dxa" w:w="60"/>
+              <w:left w:type="dxa" w:w="100"/>
+              <w:bottom w:type="dxa" w:w="60"/>
+              <w:right w:type="dxa" w:w="100"/>
+            </w:tcMar>
+          </w:tcPr>
+          <w:p>
+            <w:r>
+              <w:rPr>
+                <w:rFonts w:ascii="Calibri" w:cs="Calibri" w:eastAsia="Calibri" w:hAnsi="Calibri"/>
+                <w:sz w:val="19"/>
+                <w:szCs w:val="19"/>
+              </w:rPr>
+              <w:t xml:space="preserve">[−0.07, +0.26]</w:t>
+            </w:r>
+          </w:p>
+        </w:tc>
+        <w:tc>
+          <w:tcPr>
+            <w:tcW w:type="dxa" w:w="2000"/>
+            <w:tcMar>
+              <w:top w:type="dxa" w:w="60"/>
+              <w:left w:type="dxa" w:w="100"/>
+              <w:bottom w:type="dxa" w:w="60"/>
+              <w:right w:type="dxa" w:w="100"/>
+            </w:tcMar>
+          </w:tcPr>
+          <w:p>
+            <w:r>
+              <w:rPr>
+                <w:rFonts w:ascii="Calibri" w:cs="Calibri" w:eastAsia="Calibri" w:hAnsi="Calibri"/>
+                <w:sz w:val="19"/>
+                <w:szCs w:val="19"/>
+              </w:rPr>
+              <w:t xml:space="preserve">0.274</w:t>
+            </w:r>
+          </w:p>
+        </w:tc>
+      </w:tr>
+      <w:tr>
+        <w:tc>
+          <w:tcPr>
+            <w:tcW w:type="dxa" w:w="2100"/>
+            <w:tcMar>
+              <w:top w:type="dxa" w:w="60"/>
+              <w:left w:type="dxa" w:w="100"/>
+              <w:bottom w:type="dxa" w:w="60"/>
+              <w:right w:type="dxa" w:w="100"/>
+            </w:tcMar>
+          </w:tcPr>
+          <w:p>
+            <w:r>
+              <w:rPr>
+                <w:rFonts w:ascii="Calibri" w:cs="Calibri" w:eastAsia="Calibri" w:hAnsi="Calibri"/>
+                <w:sz w:val="19"/>
+                <w:szCs w:val="19"/>
+              </w:rPr>
+              <w:t xml:space="preserve">Guyana</w:t>
+            </w:r>
+          </w:p>
+        </w:tc>
+        <w:tc>
+          <w:tcPr>
+            <w:tcW w:type="dxa" w:w="1300"/>
+            <w:tcMar>
+              <w:top w:type="dxa" w:w="60"/>
+              <w:left w:type="dxa" w:w="100"/>
+              <w:bottom w:type="dxa" w:w="60"/>
+              <w:right w:type="dxa" w:w="100"/>
+            </w:tcMar>
+          </w:tcPr>
+          <w:p>
+            <w:r>
+              <w:rPr>
+                <w:rFonts w:ascii="Calibri" w:cs="Calibri" w:eastAsia="Calibri" w:hAnsi="Calibri"/>
+                <w:sz w:val="19"/>
+                <w:szCs w:val="19"/>
+              </w:rPr>
+              <w:t xml:space="preserve">4.770</w:t>
+            </w:r>
+          </w:p>
+        </w:tc>
+        <w:tc>
+          <w:tcPr>
+            <w:tcW w:type="dxa" w:w="1400"/>
+            <w:tcMar>
+              <w:top w:type="dxa" w:w="60"/>
+              <w:left w:type="dxa" w:w="100"/>
+              <w:bottom w:type="dxa" w:w="60"/>
+              <w:right w:type="dxa" w:w="100"/>
+            </w:tcMar>
+          </w:tcPr>
+          <w:p>
+            <w:r>
+              <w:rPr>
+                <w:rFonts w:ascii="Calibri" w:cs="Calibri" w:eastAsia="Calibri" w:hAnsi="Calibri"/>
+                <w:sz w:val="19"/>
+                <w:szCs w:val="19"/>
+              </w:rPr>
+              <w:t xml:space="preserve">+0.15</w:t>
+            </w:r>
+          </w:p>
+        </w:tc>
+        <w:tc>
+          <w:tcPr>
+            <w:tcW w:type="dxa" w:w="2560"/>
+            <w:tcMar>
+              <w:top w:type="dxa" w:w="60"/>
+              <w:left w:type="dxa" w:w="100"/>
+              <w:bottom w:type="dxa" w:w="60"/>
+              <w:right w:type="dxa" w:w="100"/>
+            </w:tcMar>
+          </w:tcPr>
+          <w:p>
+            <w:r>
+              <w:rPr>
+                <w:rFonts w:ascii="Calibri" w:cs="Calibri" w:eastAsia="Calibri" w:hAnsi="Calibri"/>
+                <w:sz w:val="19"/>
+                <w:szCs w:val="19"/>
+              </w:rPr>
+              <w:t xml:space="preserve">[−0.00, +0.30]</w:t>
+            </w:r>
+          </w:p>
+        </w:tc>
+        <w:tc>
+          <w:tcPr>
+            <w:tcW w:type="dxa" w:w="2000"/>
+            <w:tcMar>
+              <w:top w:type="dxa" w:w="60"/>
+              <w:left w:type="dxa" w:w="100"/>
+              <w:bottom w:type="dxa" w:w="60"/>
+              <w:right w:type="dxa" w:w="100"/>
+            </w:tcMar>
+          </w:tcPr>
+          <w:p>
+            <w:r>
+              <w:rPr>
+                <w:rFonts w:ascii="Calibri" w:cs="Calibri" w:eastAsia="Calibri" w:hAnsi="Calibri"/>
+                <w:sz w:val="19"/>
+                <w:szCs w:val="19"/>
+              </w:rPr>
+              <w:t xml:space="preserve">0.052</w:t>
+            </w:r>
+          </w:p>
+        </w:tc>
+      </w:tr>
+    </w:tbl>
+    <w:p>
+      <w:pPr>
+        <w:spacing w:after="120"/>
+      </w:pPr>
+      <w:r>
+        <w:rPr>
+          <w:rFonts w:ascii="Calibri" w:cs="Calibri" w:eastAsia="Calibri" w:hAnsi="Calibri"/>
+          <w:sz w:val="22"/>
+          <w:szCs w:val="22"/>
+        </w:rPr>
+        <w:t xml:space="preserve">Pooled con interacciones (base ARG): la penalidad argentina difiere significativamente de Uruguay (−0.31 por punto, p&lt;0.001), Bolivia (−0.27, p=0.002) y Surinam (−0.22, p=0.005) por un lado, y de Chile (+0.15, p=0.038), Guyana (+0.17, p=0.022) y Paraguay (+0.14, p=0.047) por el otro. Argentina está en el medio de la distribución regional.</w:t>
+      </w:r>
+    </w:p>
+    <w:p>
+      <w:pPr>
+        <w:pStyle w:val="Heading2"/>
+        <w:spacing w:after="110" w:before="220"/>
+      </w:pPr>
+      <w:r>
+        <w:rPr>
+          <w:rFonts w:ascii="Calibri" w:cs="Calibri" w:eastAsia="Calibri" w:hAnsi="Calibri"/>
+        </w:rPr>
+        <w:t xml:space="preserve">7.2 Horse race color vs. categoría, por país</w:t>
+      </w:r>
+    </w:p>
+    <w:p>
+      <w:pPr>
+        <w:spacing w:after="120"/>
+      </w:pPr>
+      <w:r>
+        <w:rPr>
+          <w:rFonts w:ascii="Calibri" w:cs="Calibri" w:eastAsia="Calibri" w:hAnsi="Calibri"/>
+          <w:sz w:val="22"/>
+          <w:szCs w:val="22"/>
+        </w:rPr>
+        <w:t xml:space="preserve">El patrón argentino ("la categoría le gana al color") no es peculiaridad nuestra: el premio por autoidentificarse blanco condicional en el tono observado es grande y significativo en Bolivia (+1.37 años), Uruguay (+1.17), Brasil (+0.89), Argentina (+0.79) y Venezuela (+0.69). Pero en Bolivia, Uruguay, Ecuador y Surinam el color también sobrevive con la categoría en la ecuación — en Argentina no. El caso argentino se distingue por ser casi puramente categorial.</w:t>
+      </w:r>
+    </w:p>
+    <w:p>
+      <w:pPr>
+        <w:pStyle w:val="Heading2"/>
+        <w:spacing w:after="110" w:before="220"/>
+      </w:pPr>
+      <w:r>
+        <w:rPr>
+          <w:rFonts w:ascii="Calibri" w:cs="Calibri" w:eastAsia="Calibri" w:hAnsi="Calibri"/>
+        </w:rPr>
+        <w:t xml:space="preserve">7.3 Mecanismo: auto-aclaramiento por país</w:t>
+      </w:r>
+    </w:p>
+    <w:p>
+      <w:pPr>
+        <w:spacing w:after="120"/>
+      </w:pPr>
+      <w:r>
+        <w:rPr>
+          <w:rFonts w:ascii="Calibri" w:cs="Calibri" w:eastAsia="Calibri" w:hAnsi="Calibri"/>
+          <w:sz w:val="22"/>
+          <w:szCs w:val="22"/>
+        </w:rPr>
+        <w:t xml:space="preserve">Diferencia del gap (auto − encuestador) entre tercil educativo alto y bajo: Brasil −0.81, Bolivia −0.73, Paraguay −0.60, Venezuela −0.52, Argentina −0.47, …, Uruguay −0.09, Guyana +0.00. La hipótesis previa (Argentina como caso extremo de auto-aclaramiento) no se sostiene: Brasil y Bolivia muestran más. Patrón sugerente: Uruguay, el país con mayor penalidad de color, es donde menos se "auto-aclara" la gente — donde el gradiente es más real, menos se negocia la autopercepción. A formalizar.</w:t>
+      </w:r>
+    </w:p>
+    <w:p>
+      <w:pPr>
+        <w:pStyle w:val="Heading2"/>
+        <w:spacing w:after="110" w:before="220"/>
+      </w:pPr>
+      <w:r>
+        <w:rPr>
+          <w:rFonts w:ascii="Calibri" w:cs="Calibri" w:eastAsia="Calibri" w:hAnsi="Calibri"/>
+        </w:rPr>
+        <w:t xml:space="preserve">7.4 Discrepancia con PERLA — abierta</w:t>
+      </w:r>
+    </w:p>
+    <w:p>
+      <w:pPr>
+        <w:spacing w:after="120"/>
+      </w:pPr>
+      <w:r>
+        <w:rPr>
+          <w:rFonts w:ascii="Calibri" w:cs="Calibri" w:eastAsia="Calibri" w:hAnsi="Calibri"/>
+          <w:sz w:val="22"/>
+          <w:szCs w:val="22"/>
+        </w:rPr>
+        <w:t xml:space="preserve">Nuestros nulos de Brasil (+0.06) y Colombia (−0.01) contrastan con los −0.5 y −0.39 de Telles et al. (2015). La sensibilidad muestra que no lo explican ni los FE de región ni el pooling de olas (Brasil da ~0 también sin FE de región y en 2010 solo). Diferencias restantes con su diseño: la ronda PERLA 2010 con controles de origen de clase (ocupación parental) y su armonización de escolaridad. Pendiente: conseguir sus archivos de replicación. Hasta resolverlo, la comparación con "el rango PERLA" debe citarse con esta nota.</w:t>
+      </w:r>
+    </w:p>
+    <w:p>
+      <w:pPr>
+        <w:pStyle w:val="Heading2"/>
+        <w:spacing w:after="110" w:before="220"/>
+      </w:pPr>
+      <w:r>
+        <w:rPr>
+          <w:rFonts w:ascii="Calibri" w:cs="Calibri" w:eastAsia="Calibri" w:hAnsi="Calibri"/>
+        </w:rPr>
+        <w:t xml:space="preserve">7.5 Lectura</w:t>
+      </w:r>
+    </w:p>
+    <w:p>
+      <w:pPr>
+        <w:spacing w:after="120"/>
+      </w:pPr>
+      <w:r>
+        <w:rPr>
+          <w:rFonts w:ascii="Calibri" w:cs="Calibri" w:eastAsia="Calibri" w:hAnsi="Calibri"/>
+          <w:sz w:val="22"/>
+          <w:szCs w:val="22"/>
+        </w:rPr>
+        <w:t xml:space="preserve">La penalidad de color argentina (−0.16, ns) es mediana en la región, no excepcional. Lo distintivo de Argentina es la forma del racismo: puramente categorial (blanco/no blanco) y con la señal cromática debilitada — consistente con el argumento histórico del crisol. Y el hallazgo regional inesperado es Uruguay: la mayor penalidad de color de Sudamérica en el país más "blanco" de la muestra, con poco auto-aclaramiento. Eso merece paper propio.</w:t>
+      </w:r>
+    </w:p>
+    <w:p>
+      <w:pPr>
+        <w:pStyle w:val="Heading1"/>
+        <w:spacing w:after="140" w:before="280"/>
+      </w:pPr>
+      <w:r>
+        <w:rPr>
+          <w:rFonts w:ascii="Calibri" w:cs="Calibri" w:eastAsia="Calibri" w:hAnsi="Calibri"/>
+        </w:rPr>
+        <w:t xml:space="preserve">8. Caveats adicionales (v0.2)</w:t>
+      </w:r>
+    </w:p>
+    <w:p>
+      <w:pPr>
+        <w:spacing w:after="120"/>
+      </w:pPr>
+      <w:r>
+        <w:rPr>
+          <w:rFonts w:ascii="Calibri" w:cs="Calibri" w:eastAsia="Calibri" w:hAnsi="Calibri"/>
+          <w:sz w:val="22"/>
+          <w:szCs w:val="22"/>
+        </w:rPr>
+        <w:t xml:space="preserve">Guyana y Surinam tienen composiciones étnicas (indo-descendientes, cimarrones) donde la escala clara→oscura captura otra cosa que en el resto; sus coeficientes no son directamente comparables. El premio blanco de Guyana (+5.68) sale de un N minúsculo de autoidentificados blancos. Venezuela 2016 en contexto de crisis. estratopri cambia de definición entre olas en algunos países (FE conservador igual).</w:t>
+      </w:r>
+    </w:p>
+    <w:p>
+      <w:pPr>
+        <w:pStyle w:val="Heading1"/>
+        <w:spacing w:after="140" w:before="280"/>
+      </w:pPr>
+      <w:r>
+        <w:rPr>
+          <w:rFonts w:ascii="Calibri" w:cs="Calibri" w:eastAsia="Calibri" w:hAnsi="Calibri"/>
+        </w:rPr>
+        <w:t xml:space="preserve">9. Agenda</w:t>
       </w:r>
     </w:p>
     <w:p>
@@ -2361,7 +4007,7 @@
           <w:sz w:val="22"/>
           <w:szCs w:val="22"/>
         </w:rPr>
-        <w:t xml:space="preserve">Pooled sudamericano con el Grand Merge (FE de país + interacciones país × color) para poner el coeficiente argentino en contexto regional.</w:t>
+        <w:t xml:space="preserve">Pooled sudamericano: HECHO (v0.2).</w:t>
       </w:r>
     </w:p>
     <w:p>
@@ -2379,7 +4025,7 @@
           <w:sz w:val="22"/>
           <w:szCs w:val="22"/>
         </w:rPr>
-        <w:t xml:space="preserve">FE de entrevistador si conseguimos el ID (archivos por ola).</w:t>
+        <w:t xml:space="preserve">Conseguir archivos de replicación de Telles et al. (2015) para resolver la discrepancia de Brasil/Colombia (§7.4).</w:t>
       </w:r>
     </w:p>
     <w:p>
@@ -2397,7 +4043,7 @@
           <w:sz w:val="22"/>
           <w:szCs w:val="22"/>
         </w:rPr>
-        <w:t xml:space="preserve">Outcomes alternativos: secundario completo (dummy); acceso a terciario/universitario.</w:t>
+        <w:t xml:space="preserve">FE de entrevistador si conseguimos el ID (archivos por ola).</w:t>
       </w:r>
     </w:p>
     <w:p>
@@ -2415,7 +4061,43 @@
           <w:sz w:val="22"/>
           <w:szCs w:val="22"/>
         </w:rPr>
-        <w:t xml:space="preserve">Sección de mecanismo: formalizar el auto-aclaramiento (gap auto−encuestador como outcome).</w:t>
+        <w:t xml:space="preserve">Outcomes alternativos: secundario completo (dummy); acceso a terciario/universitario.</w:t>
+      </w:r>
+    </w:p>
+    <w:p>
+      <w:pPr>
+        <w:pStyle w:val="ListParagraph"/>
+        <w:numPr>
+          <w:ilvl w:val="0"/>
+          <w:numId w:val="2"/>
+        </w:numPr>
+        <w:spacing w:after="100"/>
+      </w:pPr>
+      <w:r>
+        <w:rPr>
+          <w:rFonts w:ascii="Calibri" w:cs="Calibri" w:eastAsia="Calibri" w:hAnsi="Calibri"/>
+          <w:sz w:val="22"/>
+          <w:szCs w:val="22"/>
+        </w:rPr>
+        <w:t xml:space="preserve">Formalizar el auto-aclaramiento (gap como outcome; correlación agregada penalidad × auto-aclaramiento, §7.3).</w:t>
+      </w:r>
+    </w:p>
+    <w:p>
+      <w:pPr>
+        <w:pStyle w:val="ListParagraph"/>
+        <w:numPr>
+          <w:ilvl w:val="0"/>
+          <w:numId w:val="2"/>
+        </w:numPr>
+        <w:spacing w:after="100"/>
+      </w:pPr>
+      <w:r>
+        <w:rPr>
+          <w:rFonts w:ascii="Calibri" w:cs="Calibri" w:eastAsia="Calibri" w:hAnsi="Calibri"/>
+          <w:sz w:val="22"/>
+          <w:szCs w:val="22"/>
+        </w:rPr>
+        <w:t xml:space="preserve">Profundizar Uruguay (¿por qué la mayor penalidad regional?) — posible extensión o paper aparte.</w:t>
       </w:r>
     </w:p>
     <w:p>
@@ -2428,6 +4110,24 @@
           <w:rFonts w:ascii="Calibri" w:cs="Calibri" w:eastAsia="Calibri" w:hAnsi="Calibri"/>
         </w:rPr>
         <w:t xml:space="preserve">Changelog</w:t>
+      </w:r>
+    </w:p>
+    <w:p>
+      <w:pPr>
+        <w:pStyle w:val="ListParagraph"/>
+        <w:numPr>
+          <w:ilvl w:val="0"/>
+          <w:numId w:val="2"/>
+        </w:numPr>
+        <w:spacing w:after="100"/>
+      </w:pPr>
+      <w:r>
+        <w:rPr>
+          <w:rFonts w:ascii="Calibri" w:cs="Calibri" w:eastAsia="Calibri" w:hAnsi="Calibri"/>
+          <w:sz w:val="22"/>
+          <w:szCs w:val="22"/>
+        </w:rPr>
+        <w:t xml:space="preserve">v0.2 (18-jul-2026). Comparativa sudamericana: 12 países, espejo de M1 por país, pooled con interacciones, horse race y auto-aclaramiento comparado. Python replicado en R. Discrepancia con PERLA documentada como abierta.</w:t>
       </w:r>
     </w:p>
     <w:p>

</xml_diff>